<commit_message>
Add standalone update.bat and avoid AV-triggering silent installer
setup.bat no longer downloads and silently runs a Python installer
(that pattern reads as dropper behavior to some antivirus and one
report had it get killed on launch). It now just opens the official
python.org download page and asks the user to install manually,
checking "Add python.exe to PATH".

Also add update.bat + src/update_cli.py as a console fallback for
checking/applying updates without going through the GUI, and update
the user guide to match.
</commit_message>
<xml_diff>
--- a/사용가이드.docx
+++ b/사용가이드.docx
@@ -28,11 +28,6 @@
       </w:r>
     </w:p>
     <w:p>
-      <w:r>
-        <w:t>프로그램 폴더를 열고 아래 순서대로 실행하세요. 한 번만 하면 되고, 다음부터는 이 과정을 반복할 필요가 없습니다.</w:t>
-      </w:r>
-    </w:p>
-    <w:p>
       <w:pPr>
         <w:pStyle w:val="ListNumber"/>
       </w:pPr>
@@ -45,7 +40,7 @@
         <w:pStyle w:val="ListNumber"/>
       </w:pPr>
       <w:r>
-        <w:t>검은 화면(명령 프롬프트)이 뜨고 설치가 진행됩니다. 컴퓨터에 프로그램(Python)이 없으면 자동으로 내려받아 설치하므로, 인터넷에 연결된 상태여야 합니다.</w:t>
+        <w:t>이 컴퓨터에 Python이 없으면, 자동으로 파이썬 공식 다운로드 페이지(python.org)가 브라우저로 열립니다.</w:t>
       </w:r>
     </w:p>
     <w:p>
@@ -53,12 +48,54 @@
         <w:pStyle w:val="ListNumber"/>
       </w:pPr>
       <w:r>
-        <w:t>"설치 완료"라는 문구가 뜨면 아무 키나 눌러 창을 닫습니다.</w:t>
+        <w:t>그 페이지에서 노란색 "Download Python" 버튼을 눌러 설치 파일을 받고 실행합니다.</w:t>
       </w:r>
     </w:p>
     <w:p>
       <w:r>
-        <w:t>※ 설치에는 몇 분 정도 걸릴 수 있습니다. 이 과정은 이 컴퓨터에서 처음 한 번만 필요합니다.</w:t>
+        <w:rPr>
+          <w:b/>
+          <w:color w:val="C00000"/>
+        </w:rPr>
+        <w:t>★ 아주 중요: 설치 화면 맨 아래에 있는 "Add python.exe to PATH" 체크박스를 반드시 체크한 뒤 Install을 눌러야 합니다. 이걸 빠뜨리면 프로그램이 동작하지 않습니다.</w:t>
+      </w:r>
+    </w:p>
+    <w:p>
+      <w:pPr>
+        <w:pStyle w:val="ListNumber"/>
+      </w:pPr>
+      <w:r>
+        <w:t>설치가 끝나면 setup.bat을 다시 더블클릭합니다.</w:t>
+      </w:r>
+    </w:p>
+    <w:p>
+      <w:pPr>
+        <w:pStyle w:val="ListNumber"/>
+      </w:pPr>
+      <w:r>
+        <w:t>검은 화면(명령 프롬프트)이 뜨고 필요한 구성요소를 설치합니다.</w:t>
+      </w:r>
+    </w:p>
+    <w:p>
+      <w:pPr>
+        <w:pStyle w:val="ListNumber"/>
+      </w:pPr>
+      <w:r>
+        <w:t>"Setup complete"라는 문구가 뜨면 아무 키나 눌러 창을 닫습니다.</w:t>
+      </w:r>
+    </w:p>
+    <w:p>
+      <w:r>
+        <w:t>※ 이 과정은 이 컴퓨터에서 처음 한 번만 필요합니다.</w:t>
+      </w:r>
+    </w:p>
+    <w:p>
+      <w:r>
+        <w:rPr>
+          <w:i/>
+          <w:color w:val="555555"/>
+        </w:rPr>
+        <w:t>백신 프로그램이 setup.bat 실행을 막거나 창이 바로 꺼지는 경우, 백신의 최근 차단 기록(격리/보호 기록)을 확인해 "허용"으로 처리해주세요. 이 프로그램은 인터넷에서 무언가를 몰래 설치하지 않고, 필요할 때 공식 파이썬 다운로드 페이지만 열어줍니다.</w:t>
       </w:r>
     </w:p>
     <w:p/>
@@ -171,7 +208,7 @@
         <w:pStyle w:val="ListBullet"/>
       </w:pPr>
       <w:r>
-        <w:t>외국인소진율: 외국인이 보유 중인 지분 비율</w:t>
+        <w:t>외국인소진율: 외국인이 보유 중인 지분 비율(%)</w:t>
       </w:r>
     </w:p>
     <w:p>
@@ -180,6 +217,14 @@
       </w:pPr>
       <w:r>
         <w:t>거래량: 그날 거래된 총 주식 수</w:t>
+      </w:r>
+    </w:p>
+    <w:p>
+      <w:pPr>
+        <w:pStyle w:val="ListBullet"/>
+      </w:pPr>
+      <w:r>
+        <w:t>종목코드: 맨 오른쪽 열. 다른 곳에 값만 옮겨붙일 때 이 열만 빼고 복사하면 됩니다.</w:t>
       </w:r>
     </w:p>
     <w:p>
@@ -238,6 +283,32 @@
         <w:pStyle w:val="Heading2"/>
       </w:pPr>
       <w:r>
+        <w:t>setup.bat 창이 뜨자마자 바로 꺼져요</w:t>
+      </w:r>
+    </w:p>
+    <w:p>
+      <w:r>
+        <w:t>백신 프로그램이 실행을 막았을 가능성이 높습니다. 백신 프로그램의 최근 차단/격리 기록을 확인해서 setup.bat 또는 이 폴더를 "허용"으로 추가해주세요. 그래도 안 되면 setup_log.txt 파일이 폴더에 생겼는지 확인하고, 그 내용을 캡처해서 보내주세요.</w:t>
+      </w:r>
+    </w:p>
+    <w:p>
+      <w:pPr>
+        <w:pStyle w:val="Heading2"/>
+      </w:pPr>
+      <w:r>
+        <w:t>run_gui.bat을 눌러도 아무 창도 안 떠요</w:t>
+      </w:r>
+    </w:p>
+    <w:p>
+      <w:r>
+        <w:t>폴더 안에 생긴 gui_log.txt 파일을 열어보면 어떤 오류가 있었는지 나옵니다. 그 내용을 캡처해서 보내주세요.</w:t>
+      </w:r>
+    </w:p>
+    <w:p>
+      <w:pPr>
+        <w:pStyle w:val="Heading2"/>
+      </w:pPr>
+      <w:r>
         <w:t>창이 이상하게 뜨거나 버튼이 안 보여요</w:t>
       </w:r>
     </w:p>
@@ -270,6 +341,19 @@
     <w:p>
       <w:r>
         <w:t>데이터를 받아오지 못해 대부분의 종목이 "-"로 나옵니다. 인터넷 연결을 확인한 뒤 다시 실행해주세요.</w:t>
+      </w:r>
+    </w:p>
+    <w:p>
+      <w:pPr>
+        <w:pStyle w:val="Heading2"/>
+      </w:pPr>
+      <w:r>
+        <w:t>새 버전으로 업데이트하고 싶어요</w:t>
+      </w:r>
+    </w:p>
+    <w:p>
+      <w:r>
+        <w:t>run_gui.bat으로 프로그램을 연 뒤, 위쪽의 "업데이트 확인" 버튼을 누르면 됩니다. "업데이트를 적용했어"라는 메시지가 뜨면 프로그램을 껐다가 다시 실행해주세요.</w:t>
       </w:r>
     </w:p>
     <w:p/>
@@ -311,6 +395,14 @@
       </w:pPr>
       <w:r>
         <w:t>output 폴더 — 실행 결과 엑셀 파일이 저장되는 곳</w:t>
+      </w:r>
+    </w:p>
+    <w:p>
+      <w:pPr>
+        <w:pStyle w:val="ListBullet"/>
+      </w:pPr>
+      <w:r>
+        <w:t>setup_log.txt / gui_log.txt — 문제가 생겼을 때 확인하는 기록 파일</w:t>
       </w:r>
     </w:p>
     <w:sectPr>

</xml_diff>

<commit_message>
Move runtime logs into logs/, drop self-relaunch batch trick
Root now holds only files meant to be double-clicked or opened
directly (run_gui.bat, setup.bat, update.bat, guide, ticker list);
setup_log.txt/gui_log.txt/update_log.txt/.update_version move under
logs/.

Also replace the "re-invoke this file as a new process" logging
trick in setup.bat/update.bat with a plain `call :main` subroutine.
Same dual console+file output, but no recursive self-exec pattern,
which is closer to a heuristic AV would flag on a script that's
already had one confirmed antivirus kill.
</commit_message>
<xml_diff>
--- a/사용가이드.docx
+++ b/사용가이드.docx
@@ -288,7 +288,7 @@
     </w:p>
     <w:p>
       <w:r>
-        <w:t>백신 프로그램이 실행을 막았을 가능성이 높습니다. 백신 프로그램의 최근 차단/격리 기록을 확인해서 setup.bat 또는 이 폴더를 "허용"으로 추가해주세요. 그래도 안 되면 setup_log.txt 파일이 폴더에 생겼는지 확인하고, 그 내용을 캡처해서 보내주세요.</w:t>
+        <w:t>백신 프로그램이 실행을 막았을 가능성이 높습니다. 백신 프로그램의 최근 차단/격리 기록을 확인해서 setup.bat 또는 이 폴더를 "허용"으로 추가해주세요. 그래도 안 되면 logs 폴더 안의 setup_log.txt 파일을 확인하고, 그 내용을 캡처해서 보내주세요.</w:t>
       </w:r>
     </w:p>
     <w:p>
@@ -301,7 +301,7 @@
     </w:p>
     <w:p>
       <w:r>
-        <w:t>폴더 안에 생긴 gui_log.txt 파일을 열어보면 어떤 오류가 있었는지 나옵니다. 그 내용을 캡처해서 보내주세요.</w:t>
+        <w:t>logs 폴더 안의 gui_log.txt 파일을 열어보면 어떤 오류가 있었는지 나옵니다. 그 내용을 캡처해서 보내주세요.</w:t>
       </w:r>
     </w:p>
     <w:p>
@@ -402,7 +402,7 @@
         <w:pStyle w:val="ListBullet"/>
       </w:pPr>
       <w:r>
-        <w:t>setup_log.txt / gui_log.txt — 문제가 생겼을 때 확인하는 기록 파일</w:t>
+        <w:t>logs 폴더 — setup_log.txt / gui_log.txt / update_log.txt (문제가 생겼을 때 확인하는 기록 파일)</w:t>
       </w:r>
     </w:p>
     <w:sectPr>

</xml_diff>